<commit_message>
Revision de requisitos: 55 de 59 cumplidos, y los cuatro que faltaban
Legal: tres responsables del tratamiento (la universidad y los dos desarrolladores), documentos reordenados segun el art. 2.2.2.25.3.1 y leibles dentro de la app, sin depender de un dominio que no existe.

Requisitos completados: periodo del historial (RF-19), fecha de inicio del tratamiento (RF-06) y parentesco del cuidador (RF-02). Nuevo: cambiar la contrasena sin salir de la app.

Corregido: un correo con dos cuentas ya no deja una inalcanzable; las notificaciones no pueden tumbar el registro de una toma (RNF-21); contraste de textoTenue a 4.61:1 (RNF-02); el panel del cuidador ya no dice que no acompanas a nadie cuando falla la red; el servidor ya no se cae cuando la base de datos cierra una conexion.

205 pruebas en verde, 4 de extremo a extremo contra PostgreSQL real, tsc limpio.
</commit_message>
<xml_diff>
--- a/docs/Chronova-Requerimientos.docx
+++ b/docs/Chronova-Requerimientos.docx
@@ -6754,7 +6754,7 @@
                 <w:sz w:val="18"/>
                 <w:szCs w:val="18"/>
               </w:rPr>
-              <w:t xml:space="preserve">Cálculo de contraste sobre la paleta definida. Verificado.</w:t>
+              <w:t xml:space="preserve">Contraste calculado sobre los 26 pares en uso real de la paleta: 25 pasan (10 de ellos con nivel AAA). El par textoTenue sobre superficieSuave daba 4.35:1 y se corrigió oscureciendo el gris a #636F79, con lo que sube a 4.61:1. Verificado con cálculo, no por inspección.</w:t>
             </w:r>
           </w:p>
         </w:tc>
@@ -6871,7 +6871,7 @@
                 <w:sz w:val="18"/>
                 <w:szCs w:val="18"/>
               </w:rPr>
-              <w:t xml:space="preserve">Inspección de los componentes base. Verificado.</w:t>
+              <w:t xml:space="preserve">La constante ALTO_TACTIL_MINIMO se aplica en siete de los ocho elementos pulsables del proyecto. Falta en la tarjeta pulsable, donde el contenido ya supera los 64 px en la práctica, y las barras de pestañas llevan un alto fijo de 76 px que no escala con la preferencia de tamaño de letra. Verificado con una salvedad.</w:t>
             </w:r>
           </w:p>
         </w:tc>
@@ -6988,7 +6988,7 @@
                 <w:sz w:val="18"/>
                 <w:szCs w:val="18"/>
               </w:rPr>
-              <w:t xml:space="preserve">Revisión de las tarjetas de toma y de las insignias de estado. Verificado.</w:t>
+              <w:t xml:space="preserve">Los estados de una toma llevan icono y palabra además del color. El nivel de adherencia lleva color y palabra, sin icono: no se comunica solo por color, pero no cumple literalmente el requisito. Verificado con una salvedad.</w:t>
             </w:r>
           </w:p>
         </w:tc>
@@ -7807,7 +7807,7 @@
                 <w:sz w:val="18"/>
                 <w:szCs w:val="18"/>
               </w:rPr>
-              <w:t xml:space="preserve">Veinte pruebas automatizadas de control de acceso y consentimiento, repartidas entre casosDeUso.test.ts y dominio.test.ts. Verificado.</w:t>
+              <w:t xml:space="preserve">Doce pruebas específicas de autorización y consentimiento en autorizacionDeDatos.test.ts, más las de control de acceso repartidas entre casosDeUso.test.ts y dominio.test.ts. Verificado.</w:t>
             </w:r>
           </w:p>
         </w:tc>
@@ -7924,7 +7924,7 @@
                 <w:sz w:val="18"/>
                 <w:szCs w:val="18"/>
               </w:rPr>
-              <w:t xml:space="preserve">La agenda se resuelve con consultas indexadas por paciente y fecha. Medida en desarrollo por debajo de 100 ms; falta una prueba de carga reproducible incluida en el repositorio. Parcial.</w:t>
+              <w:t xml:space="preserve">Medición reproducible en el repositorio (npm run rendimiento), con carga sostenida y peticiones simultáneas. La agenda del día responde en 72,9 ms (p50), 89,8 ms (p95) y 126,6 ms (p99), sin errores. Verificado.</w:t>
             </w:r>
           </w:p>
         </w:tc>
@@ -8509,7 +8509,7 @@
                 <w:sz w:val="18"/>
                 <w:szCs w:val="18"/>
               </w:rPr>
-              <w:t xml:space="preserve">166 pruebas en menos de cuatro segundos, 20 de ellas contra la API por HTTP. Verificado.</w:t>
+              <w:t xml:space="preserve">205 pruebas en menos de seis segundos, 31 de ellas contra la API por HTTP, más 4 de extremo a extremo contra PostgreSQL real que corren aparte. Verificado.</w:t>
             </w:r>
           </w:p>
         </w:tc>
@@ -8626,7 +8626,7 @@
                 <w:sz w:val="18"/>
                 <w:szCs w:val="18"/>
               </w:rPr>
-              <w:t xml:space="preserve">Inspección del directorio de persistencia. Verificado.</w:t>
+              <w:t xml:space="preserve">Todo el SQL de acceso a datos está en repositoriosPostgres.ts. Fuera quedan el DDL de esquema.sql, que es un archivo aparte a propósito, y una consulta suelta en la utilidad de pruebas de notificaciones. Verificado con una salvedad.</w:t>
             </w:r>
           </w:p>
         </w:tc>
@@ -8977,7 +8977,7 @@
                 <w:sz w:val="18"/>
                 <w:szCs w:val="18"/>
               </w:rPr>
-              <w:t xml:space="preserve">Prueba automatizada con el cliente de Expo sustituido por uno que falla: el aviso se pierde, el registro de la toma no. Verificado.</w:t>
+              <w:t xml:space="preserve">Los cinco puntos de envío pasan por un único servicio que captura el fallo, y dos pruebas usan un notificador que lanza de verdad: la toma queda confirmada y las vencidas se cierran igual. Antes se cumplía solo porque los adaptadores capturaban sus propios errores. Verificado.</w:t>
             </w:r>
           </w:p>
         </w:tc>

</xml_diff>